<commit_message>
fix: update login activity diagram, narrative, and PDF documentation for clarity and accuracy
</commit_message>
<xml_diff>
--- a/docs/analysis/Login/Login Narrative.docx
+++ b/docs/analysis/Login/Login Narrative.docx
@@ -79,7 +79,7 @@
                 <w:szCs w:val="24"/>
                 <w:rtl/>
               </w:rPr>
-              <w:t xml:space="preserve">تسجيل الدخول (Login)</w:t>
+              <w:t xml:space="preserve">تسجيل الدخول</w:t>
             </w:r>
           </w:p>
         </w:tc>
@@ -145,7 +145,7 @@
                 <w:szCs w:val="24"/>
                 <w:rtl/>
               </w:rPr>
-              <w:t xml:space="preserve">Admin، مدير مبيعات، موظف مبيعات، مدير تسويق، موظف تسويق، مدير خدمة العملاء، موظف خدمة العملاء، مدير التوجيه الأكاديمي، موجه أكاديمي</w:t>
+              <w:t xml:space="preserve">مدير النظام، مدير مبيعات، موظف مبيعات، مدير تسويق، موظف تسويق، مدير خدمة العملاء، موظف خدمة العملاء، مدير التوجيه الأكاديمي، موجه أكاديمي</w:t>
             </w:r>
           </w:p>
         </w:tc>
@@ -211,7 +211,7 @@
                 <w:szCs w:val="24"/>
                 <w:rtl/>
               </w:rPr>
-              <w:t xml:space="preserve">تمكين المستخدم من الدخول إلى النظام والحصول على جلسة آمنة (JWT) مرتبطة بأدواره وصلاحياته.</w:t>
+              <w:t xml:space="preserve">تمكين المستخدم من الدخول إلى النظام بشكل آمن، وبحسب الأدوار والصلاحيات الممنوحة له.</w:t>
             </w:r>
           </w:p>
         </w:tc>
@@ -277,7 +277,7 @@
                 <w:szCs w:val="24"/>
                 <w:rtl/>
               </w:rPr>
-              <w:t xml:space="preserve">يدخل المستخدم اسم المستخدم وكلمة المرور، ويتحقق النظام من صحتهما ومن حالة الحساب، وعند نجاح التحقق يصدر النظام توكن (JWT) ويتيح للمستخدم الدخول إلى النظام.</w:t>
+              <w:t xml:space="preserve">يدخل المستخدم اسم المستخدم وكلمة المرور، ويتحقق النظام من صحتهما ومن حالة الحساب، وعند نجاح التحقق يسمح النظام للمستخدم بالدخول إلى النظام.</w:t>
             </w:r>
           </w:p>
         </w:tc>
@@ -341,7 +341,7 @@
                 <w:sz w:val="24"/>
                 <w:szCs w:val="24"/>
               </w:rPr>
-              <w:t xml:space="preserve">Essential</w:t>
+              <w:t xml:space="preserve">أساسية</w:t>
             </w:r>
           </w:p>
         </w:tc>
@@ -407,7 +407,7 @@
                 <w:szCs w:val="24"/>
                 <w:rtl/>
               </w:rPr>
-              <w:t xml:space="preserve">لدى المستخدم حساب أنشأه المدير (Admin).</w:t>
+              <w:t xml:space="preserve">لدى المستخدم حساب أنشأه مدير النظام.</w:t>
             </w:r>
           </w:p>
         </w:tc>
@@ -473,25 +473,25 @@
                 <w:szCs w:val="24"/>
                 <w:rtl/>
               </w:rPr>
-              <w:t xml:space="preserve">عند النجاح: يصدر توكن ويدخل المستخدم إلى النظام بأدواره وصلاحياته، وتسجل محاولة الدخول الناجحة ويعاد ضبط محدّد معدل المحاولات (Rate Limiting).</w:t>
-            </w:r>
-          </w:p>
-          <w:p>
-            <w:pPr>
-              <w:bidi/>
-              <w:spacing w:after="40" w:before="40"/>
-              <w:jc w:val="start"/>
-            </w:pPr>
-            <w:r>
-              <w:rPr>
-                <w:rFonts w:ascii="Arial" w:cs="Arial" w:eastAsia="Arial" w:hAnsi="Arial"/>
-                <w:b w:val="false"/>
-                <w:bCs w:val="false"/>
-                <w:sz w:val="24"/>
-                <w:szCs w:val="24"/>
-                <w:rtl/>
-              </w:rPr>
-              <w:t xml:space="preserve">عند الفشل: لا تنشأ جلسة، وتسجل المحاولة الفاشلة وتحتسب ضمن محدّد معدل المحاولات (Rate Limiting).</w:t>
+              <w:t xml:space="preserve">عند النجاح: يدخل المستخدم إلى النظام بأدواره وصلاحياته، وتُسجَّل محاولة الدخول الناجحة، ويُعاد احتساب المحاولات الفاشلة من الصفر.</w:t>
+            </w:r>
+          </w:p>
+          <w:p>
+            <w:pPr>
+              <w:bidi/>
+              <w:spacing w:after="40" w:before="40"/>
+              <w:jc w:val="start"/>
+            </w:pPr>
+            <w:r>
+              <w:rPr>
+                <w:rFonts w:ascii="Arial" w:cs="Arial" w:eastAsia="Arial" w:hAnsi="Arial"/>
+                <w:b w:val="false"/>
+                <w:bCs w:val="false"/>
+                <w:sz w:val="24"/>
+                <w:szCs w:val="24"/>
+                <w:rtl/>
+              </w:rPr>
+              <w:t xml:space="preserve">عند الفشل: لا يُسمح للمستخدم بالدخول، وتُسجَّل المحاولة الفاشلة وتُحتسب ضمن الحد المسموح به من المحاولات.</w:t>
             </w:r>
           </w:p>
         </w:tc>
@@ -575,25 +575,25 @@
                 <w:szCs w:val="24"/>
                 <w:rtl/>
               </w:rPr>
-              <w:t xml:space="preserve">يجب تطبيق محدّد معدل المحاولات (Rate Limiting): قفل تسجيل الدخول مؤقتاً بعد عدد محدد من المحاولات الفاشلة.</w:t>
-            </w:r>
-          </w:p>
-          <w:p>
-            <w:pPr>
-              <w:bidi/>
-              <w:spacing w:after="40" w:before="40"/>
-              <w:jc w:val="start"/>
-            </w:pPr>
-            <w:r>
-              <w:rPr>
-                <w:rFonts w:ascii="Arial" w:cs="Arial" w:eastAsia="Arial" w:hAnsi="Arial"/>
-                <w:b w:val="false"/>
-                <w:bCs w:val="false"/>
-                <w:sz w:val="24"/>
-                <w:szCs w:val="24"/>
-                <w:rtl/>
-              </w:rPr>
-              <w:t xml:space="preserve">يجب تخزين كلمات المرور بشكل مشفر (Hash).</w:t>
+              <w:t xml:space="preserve">يجب تحديد عدد المحاولات الفاشلة المسموح بها، وإيقاف تسجيل الدخول مؤقتاً عند تجاوزه.</w:t>
+            </w:r>
+          </w:p>
+          <w:p>
+            <w:pPr>
+              <w:bidi/>
+              <w:spacing w:after="40" w:before="40"/>
+              <w:jc w:val="start"/>
+            </w:pPr>
+            <w:r>
+              <w:rPr>
+                <w:rFonts w:ascii="Arial" w:cs="Arial" w:eastAsia="Arial" w:hAnsi="Arial"/>
+                <w:b w:val="false"/>
+                <w:bCs w:val="false"/>
+                <w:sz w:val="24"/>
+                <w:szCs w:val="24"/>
+                <w:rtl/>
+              </w:rPr>
+              <w:t xml:space="preserve">يجب حفظ كلمات المرور بشكل مشفّر، بحيث لا يمكن لأي شخص الاطلاع عليها.</w:t>
             </w:r>
           </w:p>
           <w:p>
@@ -629,7 +629,7 @@
                 <w:szCs w:val="24"/>
                 <w:rtl/>
               </w:rPr>
-              <w:t xml:space="preserve">لا يوجد تسجيل ذاتي ولا خيار "نسيت كلمة المرور"، وإعادة التعيين من صلاحية المدير (Admin).</w:t>
+              <w:t xml:space="preserve">لا يوجد إنشاء حساب ذاتي ولا خيار "نسيت كلمة المرور"، وإعادة تعيين كلمة المرور من صلاحية مدير النظام.</w:t>
             </w:r>
           </w:p>
         </w:tc>
@@ -1108,7 +1108,7 @@
                       <w:szCs w:val="22"/>
                       <w:rtl/>
                     </w:rPr>
-                    <w:t xml:space="preserve">6.‏ يصدر النظام توكن (JWT) مرتبطاً بأدوار المستخدم وصلاحياته.</w:t>
+                    <w:t xml:space="preserve">6.‏ يسمح النظام للمستخدم بالدخول بحسب أدواره وصلاحياته.</w:t>
                   </w:r>
                 </w:p>
               </w:tc>
@@ -1166,7 +1166,7 @@
                       <w:szCs w:val="22"/>
                       <w:rtl/>
                     </w:rPr>
-                    <w:t xml:space="preserve">7.‏ يسجل النظام محاولة الدخول الناجحة ويعيد ضبط محدّد معدل المحاولات (Rate Limiting).</w:t>
+                    <w:t xml:space="preserve">7.‏ يسجل النظام محاولة الدخول الناجحة، ويعيد احتساب المحاولات الفاشلة من الصفر.</w:t>
                   </w:r>
                 </w:p>
               </w:tc>
@@ -1420,7 +1420,7 @@
                 <w:szCs w:val="24"/>
                 <w:rtl/>
               </w:rPr>
-              <w:t xml:space="preserve">3.‏ يسجل النظام المحاولة الفاشلة ويحتسبها ضمن محدّد معدل المحاولات (Rate Limiting).</w:t>
+              <w:t xml:space="preserve">3.‏ يسجل النظام المحاولة الفاشلة ويحتسبها ضمن الحد المسموح به من المحاولات.</w:t>
             </w:r>
           </w:p>
           <w:p>
@@ -1474,25 +1474,25 @@
                 <w:szCs w:val="24"/>
                 <w:rtl/>
               </w:rPr>
-              <w:t xml:space="preserve">1.‏ يكتشف النظام أن عدد المحاولات الفاشلة تجاوز الحد المسموح وفق محدّد معدل المحاولات (Rate Limiting).</w:t>
-            </w:r>
-          </w:p>
-          <w:p>
-            <w:pPr>
-              <w:bidi/>
-              <w:spacing w:after="40" w:before="40"/>
-              <w:jc w:val="start"/>
-            </w:pPr>
-            <w:r>
-              <w:rPr>
-                <w:rFonts w:ascii="Arial" w:cs="Arial" w:eastAsia="Arial" w:hAnsi="Arial"/>
-                <w:b w:val="false"/>
-                <w:bCs w:val="false"/>
-                <w:sz w:val="24"/>
-                <w:szCs w:val="24"/>
-                <w:rtl/>
-              </w:rPr>
-              <w:t xml:space="preserve">2.‏ يقفل النظام تسجيل الدخول لهذا الحساب مؤقتاً ويسجل الحدث.</w:t>
+              <w:t xml:space="preserve">1.‏ يكتشف النظام أن عدد المحاولات الفاشلة تجاوز الحد المسموح به.</w:t>
+            </w:r>
+          </w:p>
+          <w:p>
+            <w:pPr>
+              <w:bidi/>
+              <w:spacing w:after="40" w:before="40"/>
+              <w:jc w:val="start"/>
+            </w:pPr>
+            <w:r>
+              <w:rPr>
+                <w:rFonts w:ascii="Arial" w:cs="Arial" w:eastAsia="Arial" w:hAnsi="Arial"/>
+                <w:b w:val="false"/>
+                <w:bCs w:val="false"/>
+                <w:sz w:val="24"/>
+                <w:szCs w:val="24"/>
+                <w:rtl/>
+              </w:rPr>
+              <w:t xml:space="preserve">2.‏ يوقف النظام تسجيل الدخول لهذا الحساب مؤقتاً ويسجل الحدث.</w:t>
             </w:r>
           </w:p>
           <w:p>

</xml_diff>